<commit_message>
Fix incorrect MeshGraphormer repository references
Corrected installation instructions across all guides:
- MeshGraphormer is part of ControlNet Auxiliary Preprocessors
- Changed from non-existent ZHO-ZHO-ZHO/ComfyUI-MeshGraphormer
- Updated to correct repo: Fannovel16/comfyui_controlnet_aux
- Added ComfyUI Manager installation option (easiest method)
- Updated node name to 'MeshGraphormer Hand Refiner'

Files updated:
- FIXING_HAND_ANATOMY.md/.docx
- HAND_FIXING_GUIDE.md/.docx
- INSTALLATION_TROUBLESHOOTING.md/.docx

This resolves the issue where users couldn't find the repository.
</commit_message>
<xml_diff>
--- a/FIXING_HAND_ANATOMY.docx
+++ b/FIXING_HAND_ANATOMY.docx
@@ -289,10 +289,59 @@
           <w:color w:val="336699"/>
           <w:sz w:val="28"/>
         </w:rPr>
-        <w:t>Step 1: Install MeshGraphormer Node</w:t>
+        <w:t>Step 1: Install ControlNet Auxiliary Preprocessors (includes MeshGraphormer)</w:t>
       </w:r>
     </w:p>
     <w:p/>
+    <w:p>
+      <w:r>
+        <w:rPr>
+          <w:b/>
+        </w:rPr>
+        <w:t>MeshGraphormer is part of the ControlNet Auxiliary Preprocessors package.</w:t>
+      </w:r>
+    </w:p>
+    <w:p/>
+    <w:p>
+      <w:r>
+        <w:rPr>
+          <w:b/>
+        </w:rPr>
+        <w:t>Option A: Using ComfyUI Manager (Recommended)</w:t>
+      </w:r>
+    </w:p>
+    <w:p>
+      <w:pPr>
+        <w:ind w:left="360" w:right="360"/>
+      </w:pPr>
+      <w:r>
+        <w:rPr>
+          <w:rFonts w:ascii="Courier New" w:hAnsi="Courier New"/>
+          <w:color w:val="000000"/>
+          <w:sz w:val="18"/>
+        </w:rPr>
+        <w:t>1. Open ComfyUI</w:t>
+        <w:br/>
+        <w:t>2. Click "Manager" button</w:t>
+        <w:br/>
+        <w:t>3. Click "Install Custom Nodes"</w:t>
+        <w:br/>
+        <w:t>4. Search for "ControlNet Auxiliary Preprocessors"</w:t>
+        <w:br/>
+        <w:t>5. Click "Install" on "ComfyUI's ControlNet Auxiliary Preprocessors"</w:t>
+        <w:br/>
+        <w:t>6. Restart ComfyUI</w:t>
+      </w:r>
+    </w:p>
+    <w:p/>
+    <w:p>
+      <w:r>
+        <w:rPr>
+          <w:b/>
+        </w:rPr>
+        <w:t>Option B: Manual Installation</w:t>
+      </w:r>
+    </w:p>
     <w:p>
       <w:pPr>
         <w:ind w:left="360" w:right="360"/>
@@ -305,9 +354,9 @@
         </w:rPr>
         <w:t>cd ComfyUI/custom_nodes/</w:t>
         <w:br/>
-        <w:t>git clone https://github.com/ZHO-ZHO-ZHO/ComfyUI-MeshGraphormer.git</w:t>
+        <w:t>git clone https://github.com/Fannovel16/comfyui_controlnet_aux.git</w:t>
         <w:br/>
-        <w:t>cd ComfyUI-MeshGraphormer</w:t>
+        <w:t>cd comfyui_controlnet_aux</w:t>
         <w:br/>
         <w:t>pip install -r requirements.txt</w:t>
         <w:br/>
@@ -318,7 +367,39 @@
     <w:p/>
     <w:p>
       <w:r>
-        <w:t>The node will automatically download the MeshGraphormer model (~200MB) on first use.</w:t>
+        <w:rPr>
+          <w:b/>
+        </w:rPr>
+        <w:t>Option C: Manual Download (No Git)</w:t>
+      </w:r>
+    </w:p>
+    <w:p>
+      <w:pPr>
+        <w:ind w:left="360" w:right="360"/>
+      </w:pPr>
+      <w:r>
+        <w:rPr>
+          <w:rFonts w:ascii="Courier New" w:hAnsi="Courier New"/>
+          <w:color w:val="000000"/>
+          <w:sz w:val="18"/>
+        </w:rPr>
+        <w:t>1. Visit: https://github.com/Fannovel16/comfyui_controlnet_aux</w:t>
+        <w:br/>
+        <w:t>2. Click "Code" → "Download ZIP"</w:t>
+        <w:br/>
+        <w:t>3. Extract to: ComfyUI/custom_nodes/comfyui_controlnet_aux/</w:t>
+        <w:br/>
+        <w:t>4. Open terminal in that folder</w:t>
+        <w:br/>
+        <w:t>5. Run: pip install -r requirements.txt</w:t>
+        <w:br/>
+        <w:t>6. Restart ComfyUI</w:t>
+      </w:r>
+    </w:p>
+    <w:p/>
+    <w:p>
+      <w:r>
+        <w:t>The MeshGraphormer model will automatically download (~200MB) on first use.</w:t>
       </w:r>
     </w:p>
     <w:p/>
@@ -565,15 +646,17 @@
         <w:t>└─────────────────────────────────────────────────────────────────┘</w:t>
         <w:br/>
         <w:br/>
-        <w:t>[4] MeshGraphormer-hand (from ComfyUI-MeshGraphormer)</w:t>
+        <w:t>[4] MeshGraphormer Hand Refiner (from ControlNet Auxiliary Preprocessors)</w:t>
+        <w:br/>
+        <w:t xml:space="preserve">    # Also known as: MeshGraphormer-DepthMapPreprocessor</w:t>
         <w:br/>
         <w:t xml:space="preserve">    ├─ image: [3] cropped hands</w:t>
         <w:br/>
-        <w:t xml:space="preserve">    └─ output_type: "depth"  # Creates depth map from 3D hand mesh</w:t>
+        <w:t xml:space="preserve">    └─ Output: depth map showing anatomically correct hand structure</w:t>
         <w:br/>
         <w:t xml:space="preserve">         │</w:t>
         <w:br/>
-        <w:t xml:space="preserve">         └──&gt; [Hand Depth Map - anatomically correct]</w:t>
+        <w:t xml:space="preserve">         └──&gt; [Hand Depth Map - anatomically correct with 5 fingers]</w:t>
         <w:br/>
         <w:br/>
         <w:t>[5] ImageResize</w:t>

</xml_diff>